<commit_message>
Plan: the six questions of fact, in English.
Co-Authored-By: Claude Fable 5.1 <noreply@anthropic.com>
</commit_message>
<xml_diff>
--- a/expo/plan/QUESTIONS_2026-09-11.docx
+++ b/expo/plan/QUESTIONS_2026-09-11.docx
@@ -27,7 +27,7 @@
           <w:i w:val="0"/>
           <w:sz w:val="44"/>
         </w:rPr>
-        <w:t>Шесть вопросов по фактам зала</w:t>
+        <w:t>Six Questions of Fact</w:t>
       </w:r>
     </w:p>
     <w:p>
@@ -41,7 +41,7 @@
           <w:color w:val="5A5A5A"/>
           <w:sz w:val="22"/>
         </w:rPr>
-        <w:t>Где книга Джима расходится с тем, что висит в экспозиции. Для решения — 11 сентября 2026</w:t>
+        <w:t>Where Jim Glidewell’s memoir disagrees with what hangs in the hall. For decision — September 11, 2026</w:t>
       </w:r>
     </w:p>
     <w:p>
@@ -53,7 +53,7 @@
           <w:b w:val="0"/>
           <w:i w:val="0"/>
         </w:rPr>
-        <w:t>Все карточки зала заполнены по книге «Constant Change» (Jim Glidewell, Harriman House, 2020) и по исследовательской базе проекта. В шести местах книга спорит с тем, что уже стоит на стенах и постаментах. В статьях на страницах эти расхождения названы открыто, ни одна цифра на стене сама по себе не менялась, кроме одной подписи под 1973 годом (см. вопрос 1). Решение по каждому пункту — за вами: отметьте вариант.</w:t>
+        <w:t>Every card in the hall now carries an article written from “Constant Change” (Jim Glidewell, Harriman House, 2020) and from the project’s research base. In six places the book contradicts what already stands on the walls and plinths. The articles name each disagreement openly; no figure on a wall has been changed on its own, except one caption under 1973 (see question 1). Each item is a decision for the owner of the exhibition — please tick an option.</w:t>
       </w:r>
     </w:p>
     <w:p>
@@ -66,7 +66,7 @@
           <w:i w:val="0"/>
           <w:sz w:val="28"/>
         </w:rPr>
-        <w:t>1.  1973 · Где была вторая лаборатория?</w:t>
+        <w:t>1.  1973 · Where was the second laboratory?</w:t>
       </w:r>
     </w:p>
     <w:p>
@@ -81,7 +81,7 @@
           <w:color w:val="787878"/>
           <w:sz w:val="17"/>
         </w:rPr>
-        <w:t>ЧТО СТОИТ В ЗАЛЕ</w:t>
+        <w:t>WHAT STANDS IN THE HALL</w:t>
       </w:r>
     </w:p>
     <w:p>
@@ -90,7 +90,7 @@
           <w:b w:val="0"/>
           <w:i w:val="0"/>
         </w:rPr>
-        <w:t>Подпись под постаментом гласила: «Jim opens a second lab in El Toro — the one-man bench starts to multiply.»</w:t>
+        <w:t>The caption under the plinth read: “Jim opens a second lab in El Toro — the one-man bench starts to multiply.”</w:t>
       </w:r>
     </w:p>
     <w:p>
@@ -105,7 +105,7 @@
           <w:color w:val="787878"/>
           <w:sz w:val="17"/>
         </w:rPr>
-        <w:t>ЧТО ГОВОРИТ КНИГА</w:t>
+        <w:t>WHAT THE BOOK SAYS</w:t>
       </w:r>
     </w:p>
     <w:p>
@@ -117,7 +117,7 @@
         <w:rPr>
           <w:i/>
         </w:rPr>
-        <w:t>«The second lab, top left third floor at 172 N. Tustin Ave., Orange, CA»</w:t>
+        <w:t>“The second lab, top left third floor at 172 N. Tustin Ave., Orange, CA”</w:t>
       </w:r>
     </w:p>
     <w:p>
@@ -130,7 +130,7 @@
           <w:color w:val="6E6E6E"/>
           <w:sz w:val="18"/>
         </w:rPr>
-        <w:t>Constant Change, раздел «My Life in Pictures», подпись к фотографии</w:t>
+        <w:t>Constant Change, “My Life in Pictures”, photo caption</w:t>
       </w:r>
     </w:p>
     <w:p>
@@ -145,7 +145,7 @@
           <w:color w:val="787878"/>
           <w:sz w:val="17"/>
         </w:rPr>
-        <w:t>ЧТО СДЕЛАНО ПОКА</w:t>
+        <w:t>DONE SO FAR</w:t>
       </w:r>
     </w:p>
     <w:p>
@@ -154,7 +154,7 @@
           <w:b w:val="0"/>
           <w:i w:val="0"/>
         </w:rPr>
-        <w:t>Эль-Торо в книге не упоминается ни разу. Я уже переписал подпись под постаментом на адрес из книги, потому что источника для Эль-Торо в проекте нет. Если он есть у вас — вернём.</w:t>
+        <w:t>El Toro is not mentioned anywhere in the book. The caption under the plinth has already been rewritten to the address from the book, because the project has no source for El Toro. If you have one, it goes back.</w:t>
       </w:r>
     </w:p>
     <w:p>
@@ -169,7 +169,7 @@
           <w:color w:val="787878"/>
           <w:sz w:val="17"/>
         </w:rPr>
-        <w:t>ВОПРОС</w:t>
+        <w:t>QUESTION</w:t>
       </w:r>
     </w:p>
     <w:p>
@@ -181,7 +181,7 @@
           <w:b/>
           <w:i w:val="0"/>
         </w:rPr>
-        <w:t>Какой адрес остаётся на стене 1973 года?</w:t>
+        <w:t>Which address stays on the 1973 wall?</w:t>
       </w:r>
     </w:p>
     <w:p>
@@ -196,7 +196,7 @@
         <w:t xml:space="preserve">☐  </w:t>
       </w:r>
       <w:r>
-        <w:t>172 N. Tustin Ave., Orange — по книге (сейчас так и стоит)</w:t>
+        <w:t>172 N. Tustin Ave., Orange — per the book (as it stands now)</w:t>
       </w:r>
     </w:p>
     <w:p>
@@ -211,7 +211,7 @@
         <w:t xml:space="preserve">☐  </w:t>
       </w:r>
       <w:r>
-        <w:t>El Toro — вернуть, есть источник надёжнее книги</w:t>
+        <w:t>El Toro — restore it; there is a source more reliable than the book</w:t>
       </w:r>
     </w:p>
     <w:p>
@@ -226,7 +226,7 @@
         <w:t xml:space="preserve">☐  </w:t>
       </w:r>
       <w:r>
-        <w:t>Не называть адрес вовсе: «a second lab in Orange County»</w:t>
+        <w:t>No address at all: “a second lab in Orange County”</w:t>
       </w:r>
     </w:p>
     <w:p>
@@ -241,7 +241,7 @@
         <w:t xml:space="preserve">☐  </w:t>
       </w:r>
       <w:r>
-        <w:t>Другое: ____________________________________________________</w:t>
+        <w:t>Other: ______________________________________________________</w:t>
       </w:r>
     </w:p>
     <w:p>
@@ -254,7 +254,7 @@
           <w:i w:val="0"/>
           <w:sz w:val="28"/>
         </w:rPr>
-        <w:t>2.  1973 · Чья фотография висела под «El Toro — the second lab»?</w:t>
+        <w:t>2.  1973 · Whose photograph hung under “El Toro — the second lab”?</w:t>
       </w:r>
     </w:p>
     <w:p>
@@ -269,7 +269,7 @@
           <w:color w:val="787878"/>
           <w:sz w:val="17"/>
         </w:rPr>
-        <w:t>ЧТО СТОИТ В ЗАЛЕ</w:t>
+        <w:t>WHAT STANDS IN THE HALL</w:t>
       </w:r>
     </w:p>
     <w:p>
@@ -278,7 +278,7 @@
           <w:b w:val="0"/>
           <w:i w:val="0"/>
         </w:rPr>
-        <w:t>На стене 1973 года висел снимок трёхэтажного здания с логотипом Glidewell и подписью «El Toro — the second lab».</w:t>
+        <w:t>The 1973 wall carried a photograph of a three-storey building with the Glidewell logo, captioned “El Toro — the second lab”.</w:t>
       </w:r>
     </w:p>
     <w:p>
@@ -293,7 +293,7 @@
           <w:color w:val="787878"/>
           <w:sz w:val="17"/>
         </w:rPr>
-        <w:t>ЧТО ГОВОРИТ КНИГА</w:t>
+        <w:t>WHAT THE BOOK SAYS</w:t>
       </w:r>
     </w:p>
     <w:p>
@@ -305,7 +305,7 @@
         <w:rPr>
           <w:i/>
         </w:rPr>
-        <w:t>«The fourth lab, 303 W. Palm Ave., Orange, CA (1975–1984)»</w:t>
+        <w:t>“The fourth lab, 303 W. Palm Ave., Orange, CA (1975–1984)”</w:t>
       </w:r>
     </w:p>
     <w:p>
@@ -318,7 +318,7 @@
           <w:color w:val="6E6E6E"/>
           <w:sz w:val="18"/>
         </w:rPr>
-        <w:t>Constant Change, «My Life in Pictures», подпись к той же фотографии</w:t>
+        <w:t>Constant Change, “My Life in Pictures”, caption to the same photograph</w:t>
       </w:r>
     </w:p>
     <w:p>
@@ -333,7 +333,7 @@
           <w:color w:val="787878"/>
           <w:sz w:val="17"/>
         </w:rPr>
-        <w:t>ЧТО СДЕЛАНО ПОКА</w:t>
+        <w:t>DONE SO FAR</w:t>
       </w:r>
     </w:p>
     <w:p>
@@ -342,7 +342,7 @@
           <w:b w:val="0"/>
           <w:i w:val="0"/>
         </w:rPr>
-        <w:t>По вашему наброску снимок со стены 1973 года убран. На странице 1973 он остался — с честной подписью: четвёртая лаборатория, Уэст-Палм-авеню.</w:t>
+        <w:t>Per your sketch the photograph has been taken off the 1973 wall. It remains on the 1973 reading page, with an honest caption: the fourth lab, West Palm Avenue.</w:t>
       </w:r>
     </w:p>
     <w:p>
@@ -357,7 +357,7 @@
           <w:color w:val="787878"/>
           <w:sz w:val="17"/>
         </w:rPr>
-        <w:t>ВОПРОС</w:t>
+        <w:t>QUESTION</w:t>
       </w:r>
     </w:p>
     <w:p>
@@ -369,7 +369,7 @@
           <w:b/>
           <w:i w:val="0"/>
         </w:rPr>
-        <w:t>Где показывать этот снимок?</w:t>
+        <w:t>Where should this photograph be shown?</w:t>
       </w:r>
     </w:p>
     <w:p>
@@ -384,7 +384,7 @@
         <w:t xml:space="preserve">☐  </w:t>
       </w:r>
       <w:r>
-        <w:t>Только на странице 1973, как «четвёртая лаборатория» (сейчас так)</w:t>
+        <w:t>Only on the 1973 page, as “the fourth lab” (as it stands now)</w:t>
       </w:r>
     </w:p>
     <w:p>
@@ -399,7 +399,7 @@
         <w:t xml:space="preserve">☐  </w:t>
       </w:r>
       <w:r>
-        <w:t>Перенести на стену 1976 года, рядом с интерьером той же лаборатории</w:t>
+        <w:t>Move it to the 1976 wall, beside the interior of the same lab</w:t>
       </w:r>
     </w:p>
     <w:p>
@@ -414,7 +414,7 @@
         <w:t xml:space="preserve">☐  </w:t>
       </w:r>
       <w:r>
-        <w:t>Убрать из зала совсем</w:t>
+        <w:t>Remove it from the hall altogether</w:t>
       </w:r>
     </w:p>
     <w:p>
@@ -429,7 +429,7 @@
         <w:t xml:space="preserve">☐  </w:t>
       </w:r>
       <w:r>
-        <w:t>Другое: ____________________________________________________</w:t>
+        <w:t>Other: ______________________________________________________</w:t>
       </w:r>
     </w:p>
     <w:p>
@@ -442,7 +442,7 @@
           <w:i w:val="0"/>
           <w:sz w:val="28"/>
         </w:rPr>
-        <w:t>3.  1970 · Кухонный стол или лаборатория в Тастине?</w:t>
+        <w:t>3.  1970 · A kitchen table, or a laboratory in Tustin?</w:t>
       </w:r>
     </w:p>
     <w:p>
@@ -457,7 +457,7 @@
           <w:color w:val="787878"/>
           <w:sz w:val="17"/>
         </w:rPr>
-        <w:t>ЧТО СТОИТ В ЗАЛЕ</w:t>
+        <w:t>WHAT STANDS IN THE HALL</w:t>
       </w:r>
     </w:p>
     <w:p>
@@ -466,7 +466,7 @@
           <w:b w:val="0"/>
           <w:i w:val="0"/>
         </w:rPr>
-        <w:t>В исследовательской базе основание описано как «одинокий техник за кухонным столом». На стене 1970 года: «Jim, a hand technician, founds a one-man ceramics lab in Orange County, CA» — нейтрально.</w:t>
+        <w:t>The research base describes the founding as “a lone technician at a kitchen table”. The 1970 wall is neutral: “Jim, a hand technician, founds a one-man ceramics lab in Orange County, CA”.</w:t>
       </w:r>
     </w:p>
     <w:p>
@@ -481,7 +481,7 @@
           <w:color w:val="787878"/>
           <w:sz w:val="17"/>
         </w:rPr>
-        <w:t>ЧТО ГОВОРИТ КНИГА</w:t>
+        <w:t>WHAT THE BOOK SAYS</w:t>
       </w:r>
     </w:p>
     <w:p>
@@ -493,7 +493,7 @@
         <w:rPr>
           <w:i/>
         </w:rPr>
-        <w:t>«It was a tiny place I set up after a fellow sold me my first porcelain furnace for $300. It couldn’t have been larger than 500 square feet, but it was my very own lab!»</w:t>
+        <w:t>“It was a tiny place I set up after a fellow sold me my first porcelain furnace for $300. It couldn’t have been larger than 500 square feet, but it was my very own lab!”</w:t>
       </w:r>
     </w:p>
     <w:p>
@@ -506,7 +506,7 @@
           <w:color w:val="6E6E6E"/>
           <w:sz w:val="18"/>
         </w:rPr>
-        <w:t>Constant Change, глава о начале дела</w:t>
+        <w:t>Constant Change, on starting the business</w:t>
       </w:r>
     </w:p>
     <w:p>
@@ -518,7 +518,7 @@
         <w:rPr>
           <w:i/>
         </w:rPr>
-        <w:t>«The first lab, bottom floor at 130 El Camino Real, Tustin, CA»</w:t>
+        <w:t>“The first lab, bottom floor at 130 El Camino Real, Tustin, CA”</w:t>
       </w:r>
     </w:p>
     <w:p>
@@ -531,7 +531,7 @@
           <w:color w:val="6E6E6E"/>
           <w:sz w:val="18"/>
         </w:rPr>
-        <w:t>Constant Change, «My Life in Pictures»</w:t>
+        <w:t>Constant Change, “My Life in Pictures”</w:t>
       </w:r>
     </w:p>
     <w:p>
@@ -546,7 +546,7 @@
           <w:color w:val="787878"/>
           <w:sz w:val="17"/>
         </w:rPr>
-        <w:t>ЧТО СДЕЛАНО ПОКА</w:t>
+        <w:t>DONE SO FAR</w:t>
       </w:r>
     </w:p>
     <w:p>
@@ -555,7 +555,7 @@
           <w:b w:val="0"/>
           <w:i w:val="0"/>
         </w:rPr>
-        <w:t>Книга: отдельное помещение около 500 кв. футов на первом этаже, 130 El Camino Real, Тастин, с чужими верстаками и литейной машиной, куплено оборудование на 4 000 долларов. Кухонного стола в книге нет. Статья на странице 1970 идёт по книге.</w:t>
+        <w:t>The book: a separate ground-floor space of about 500 sq ft at 130 El Camino Real, Tustin, with benches and a casting machine already in place, and $4,000 of used equipment. There is no kitchen table in the book. The 1970 article follows the book.</w:t>
       </w:r>
     </w:p>
     <w:p>
@@ -570,7 +570,7 @@
           <w:color w:val="787878"/>
           <w:sz w:val="17"/>
         </w:rPr>
-        <w:t>ВОПРОС</w:t>
+        <w:t>QUESTION</w:t>
       </w:r>
     </w:p>
     <w:p>
@@ -582,7 +582,7 @@
           <w:b/>
           <w:i w:val="0"/>
         </w:rPr>
-        <w:t>Что считать каноном для 1970 года?</w:t>
+        <w:t>What is the canon for 1970?</w:t>
       </w:r>
     </w:p>
     <w:p>
@@ -597,7 +597,7 @@
         <w:t xml:space="preserve">☐  </w:t>
       </w:r>
       <w:r>
-        <w:t>Лаборатория в Тастине, 500 кв. футов — по книге (статья уже так)</w:t>
+        <w:t>The Tustin laboratory, 500 sq ft — per the book (the article already says so)</w:t>
       </w:r>
     </w:p>
     <w:p>
@@ -612,7 +612,7 @@
         <w:t xml:space="preserve">☐  </w:t>
       </w:r>
       <w:r>
-        <w:t>Оставить нейтральную формулировку на стене, книгу — только на странице</w:t>
+        <w:t>Keep the neutral wording on the wall; the book only on the page</w:t>
       </w:r>
     </w:p>
     <w:p>
@@ -627,7 +627,7 @@
         <w:t xml:space="preserve">☐  </w:t>
       </w:r>
       <w:r>
-        <w:t>Есть другой источник про «кухонный стол» — прислать</w:t>
+        <w:t>There is another source for the “kitchen table” — to be supplied</w:t>
       </w:r>
     </w:p>
     <w:p>
@@ -642,7 +642,7 @@
         <w:t xml:space="preserve">☐  </w:t>
       </w:r>
       <w:r>
-        <w:t>Другое: ____________________________________________________</w:t>
+        <w:t>Other: ______________________________________________________</w:t>
       </w:r>
     </w:p>
     <w:p>
@@ -655,7 +655,7 @@
           <w:i w:val="0"/>
           <w:sz w:val="28"/>
         </w:rPr>
-        <w:t>4.  1989 · 175 сотрудников и 3 500 дантистов?</w:t>
+        <w:t>4.  1989 · 175 employees and 3,500 dentists?</w:t>
       </w:r>
     </w:p>
     <w:p>
@@ -670,7 +670,7 @@
           <w:color w:val="787878"/>
           <w:sz w:val="17"/>
         </w:rPr>
-        <w:t>ЧТО СТОИТ В ЗАЛЕ</w:t>
+        <w:t>WHAT STANDS IN THE HALL</w:t>
       </w:r>
     </w:p>
     <w:p>
@@ -679,7 +679,7 @@
           <w:b w:val="0"/>
           <w:i w:val="0"/>
         </w:rPr>
-        <w:t>Стена 1989 года: «Still in Orange, California: 175 people now serve more than 3,500 dentists, and 95% of cases arrive by mail.»</w:t>
+        <w:t>The 1989 wall: “Still in Orange, California: 175 people now serve more than 3,500 dentists, and 95% of cases arrive by mail.”</w:t>
       </w:r>
     </w:p>
     <w:p>
@@ -694,7 +694,7 @@
           <w:color w:val="787878"/>
           <w:sz w:val="17"/>
         </w:rPr>
-        <w:t>ЧТО ГОВОРИТ КНИГА</w:t>
+        <w:t>WHAT THE BOOK SAYS</w:t>
       </w:r>
     </w:p>
     <w:p>
@@ -706,7 +706,7 @@
         <w:rPr>
           <w:i/>
         </w:rPr>
-        <w:t>«There were 65 employees working at Glidewell. By the end of my first week, we were down to 63…»</w:t>
+        <w:t>“There were 65 employees working at Glidewell. By the end of my first week, we were down to 63…”</w:t>
       </w:r>
     </w:p>
     <w:p>
@@ -719,7 +719,7 @@
           <w:color w:val="6E6E6E"/>
           <w:sz w:val="18"/>
         </w:rPr>
-        <w:t>Constant Change, глава Даррила Уитроу — январь 1988</w:t>
+        <w:t>Constant Change, Darryl Withrow’s chapter — January 1988</w:t>
       </w:r>
     </w:p>
     <w:p>
@@ -731,7 +731,7 @@
         <w:rPr>
           <w:i/>
         </w:rPr>
-        <w:t>«So, I moved 40 people into the new 15,000-square-foot building and was quite happy until we reached 150 employees. Then it was time to move again.»</w:t>
+        <w:t>“So, I moved 40 people into the new 15,000-square-foot building and was quite happy until we reached 150 employees. Then it was time to move again.”</w:t>
       </w:r>
     </w:p>
     <w:p>
@@ -744,7 +744,7 @@
           <w:color w:val="6E6E6E"/>
           <w:sz w:val="18"/>
         </w:rPr>
-        <w:t>Constant Change — переезд 1993 года</w:t>
+        <w:t>Constant Change — on the 1993 move</w:t>
       </w:r>
     </w:p>
     <w:p>
@@ -756,7 +756,7 @@
         <w:rPr>
           <w:i/>
         </w:rPr>
-        <w:t>«Where we once served 500 dentists, we now service 58,000 or more.»</w:t>
+        <w:t>“Where we once served 500 dentists, we now service 58,000 or more.”</w:t>
       </w:r>
     </w:p>
     <w:p>
@@ -769,7 +769,7 @@
           <w:color w:val="6E6E6E"/>
           <w:sz w:val="18"/>
         </w:rPr>
-        <w:t>Constant Change, глава о маркетинге</w:t>
+        <w:t>Constant Change, on marketing</w:t>
       </w:r>
     </w:p>
     <w:p>
@@ -784,7 +784,7 @@
           <w:color w:val="787878"/>
           <w:sz w:val="17"/>
         </w:rPr>
-        <w:t>ЧТО СДЕЛАНО ПОКА</w:t>
+        <w:t>DONE SO FAR</w:t>
       </w:r>
     </w:p>
     <w:p>
@@ -793,7 +793,7 @@
           <w:b w:val="0"/>
           <w:i w:val="0"/>
         </w:rPr>
-        <w:t>По книге между 1988 и 1993 годом штат рос от 65 до 150 человек, то есть в 1989-м вряд ли было 175. «3 500 дантистов» книга не подтверждает и не опровергает: «500 dentists» относится к неназванному раннему периоду. В статье 1989 года оба счёта стоят рядом с пометкой, что ведомости разные. Цифры на стене не тронуты.</w:t>
+        <w:t>By the book, headcount grew from 65 to 150 between 1988 and 1993, so 175 in 1989 is unlikely. The book neither confirms nor denies “3,500 dentists”; its “500 dentists” refers to an unnamed early period. The 1989 article shows both counts side by side and says the ledgers differ. The figures on the wall are untouched.</w:t>
       </w:r>
     </w:p>
     <w:p>
@@ -808,7 +808,7 @@
           <w:color w:val="787878"/>
           <w:sz w:val="17"/>
         </w:rPr>
-        <w:t>ВОПРОС</w:t>
+        <w:t>QUESTION</w:t>
       </w:r>
     </w:p>
     <w:p>
@@ -820,7 +820,7 @@
           <w:b/>
           <w:i w:val="0"/>
         </w:rPr>
-        <w:t>Что делать с цифрами на стене 1989 года?</w:t>
+        <w:t>What happens to the figures on the 1989 wall?</w:t>
       </w:r>
     </w:p>
     <w:p>
@@ -835,7 +835,7 @@
         <w:t xml:space="preserve">☐  </w:t>
       </w:r>
       <w:r>
-        <w:t>Оставить 175 / 3 500 — это данные компании, книга считает иначе</w:t>
+        <w:t>Keep 175 / 3,500 — company data; the book counts differently</w:t>
       </w:r>
     </w:p>
     <w:p>
@@ -850,7 +850,7 @@
         <w:t xml:space="preserve">☐  </w:t>
       </w:r>
       <w:r>
-        <w:t>Заменить на книжные: «about 100 people», без числа дантистов</w:t>
+        <w:t>Replace with the book’s: “about 100 people”, no dentist count</w:t>
       </w:r>
     </w:p>
     <w:p>
@@ -865,7 +865,7 @@
         <w:t xml:space="preserve">☐  </w:t>
       </w:r>
       <w:r>
-        <w:t>Убрать числа со стены, оставить только «95% of cases arrive by mail»</w:t>
+        <w:t>Take the numbers off the wall; keep only “95% of cases arrive by mail”</w:t>
       </w:r>
     </w:p>
     <w:p>
@@ -880,7 +880,7 @@
         <w:t xml:space="preserve">☐  </w:t>
       </w:r>
       <w:r>
-        <w:t>Другое: ____________________________________________________</w:t>
+        <w:t>Other: ______________________________________________________</w:t>
       </w:r>
     </w:p>
     <w:p>
@@ -893,7 +893,7 @@
           <w:i w:val="0"/>
           <w:sz w:val="28"/>
         </w:rPr>
-        <w:t>5.  1993 · 70 000 или 75 000 квадратных футов?</w:t>
+        <w:t>5.  1993 · 70,000 or 75,000 square feet?</w:t>
       </w:r>
     </w:p>
     <w:p>
@@ -908,7 +908,7 @@
           <w:color w:val="787878"/>
           <w:sz w:val="17"/>
         </w:rPr>
-        <w:t>ЧТО СТОИТ В ЗАЛЕ</w:t>
+        <w:t>WHAT STANDS IN THE HALL</w:t>
       </w:r>
     </w:p>
     <w:p>
@@ -917,7 +917,7 @@
           <w:b w:val="0"/>
           <w:i w:val="0"/>
         </w:rPr>
-        <w:t>На постаменте 1993 года стоит макет здания на 4141 MacArthur Blvd; площадь в зале пока не написана, в статье указано 70 000.</w:t>
+        <w:t>The 1993 plinth carries the massing model of 4141 MacArthur Blvd. The floor area is not written in the hall yet; the article says 70,000.</w:t>
       </w:r>
     </w:p>
     <w:p>
@@ -932,7 +932,7 @@
           <w:color w:val="787878"/>
           <w:sz w:val="17"/>
         </w:rPr>
-        <w:t>ЧТО ГОВОРИТ КНИГА</w:t>
+        <w:t>WHAT THE BOOK SAYS</w:t>
       </w:r>
     </w:p>
     <w:p>
@@ -944,7 +944,7 @@
         <w:rPr>
           <w:i/>
         </w:rPr>
-        <w:t>«In 1993, we moved into our current 75,000-square-foot building. We occupied the top floor with my 150 employees.»</w:t>
+        <w:t>“In 1993, we moved into our current 75,000-square-foot building. We occupied the top floor with my 150 employees.”</w:t>
       </w:r>
     </w:p>
     <w:p>
@@ -957,7 +957,7 @@
           <w:color w:val="6E6E6E"/>
           <w:sz w:val="18"/>
         </w:rPr>
-        <w:t>Constant Change, глава о росте</w:t>
+        <w:t>Constant Change, on growth</w:t>
       </w:r>
     </w:p>
     <w:p>
@@ -969,7 +969,7 @@
         <w:rPr>
           <w:i/>
         </w:rPr>
-        <w:t>«And yet I bought this entire 70,000 square-foot building for $50 per square foot.»</w:t>
+        <w:t>“And yet I bought this entire 70,000 square-foot building for $50 per square foot.”</w:t>
       </w:r>
     </w:p>
     <w:p>
@@ -982,7 +982,7 @@
           <w:color w:val="6E6E6E"/>
           <w:sz w:val="18"/>
         </w:rPr>
-        <w:t>Constant Change, глава о банке и покупке здания</w:t>
+        <w:t>Constant Change, on the bank and the purchase of the building</w:t>
       </w:r>
     </w:p>
     <w:p>
@@ -997,7 +997,7 @@
           <w:color w:val="787878"/>
           <w:sz w:val="17"/>
         </w:rPr>
-        <w:t>ЧТО СДЕЛАНО ПОКА</w:t>
+        <w:t>DONE SO FAR</w:t>
       </w:r>
     </w:p>
     <w:p>
@@ -1006,7 +1006,7 @@
           <w:b w:val="0"/>
           <w:i w:val="0"/>
         </w:rPr>
-        <w:t>Джим называет обе цифры в разных главах. Для статьи я взял 70 000 — из главы, где он подробно описывает саму сделку (50 долларов за фут, кредит 2,7 млн от Far East National Bank).</w:t>
+        <w:t>Jim gives both figures in different chapters. The article uses 70,000 — from the chapter where he describes the deal itself in detail ($50 per sq ft, the $2.7M loan from Far East National Bank).</w:t>
       </w:r>
     </w:p>
     <w:p>
@@ -1021,7 +1021,7 @@
           <w:color w:val="787878"/>
           <w:sz w:val="17"/>
         </w:rPr>
-        <w:t>ВОПРОС</w:t>
+        <w:t>QUESTION</w:t>
       </w:r>
     </w:p>
     <w:p>
@@ -1033,7 +1033,7 @@
           <w:b/>
           <w:i w:val="0"/>
         </w:rPr>
-        <w:t>Какую площадь считать верной?</w:t>
+        <w:t>Which floor area is correct?</w:t>
       </w:r>
     </w:p>
     <w:p>
@@ -1048,7 +1048,7 @@
         <w:t xml:space="preserve">☐  </w:t>
       </w:r>
       <w:r>
-        <w:t>70 000 кв. футов (сейчас в статье)</w:t>
+        <w:t>70,000 sq ft (as the article says now)</w:t>
       </w:r>
     </w:p>
     <w:p>
@@ -1063,7 +1063,7 @@
         <w:t xml:space="preserve">☐  </w:t>
       </w:r>
       <w:r>
-        <w:t>75 000 кв. футов</w:t>
+        <w:t>75,000 sq ft</w:t>
       </w:r>
     </w:p>
     <w:p>
@@ -1078,7 +1078,7 @@
         <w:t xml:space="preserve">☐  </w:t>
       </w:r>
       <w:r>
-        <w:t>Писать «about 70,000» и не уточнять</w:t>
+        <w:t>Write “about 70,000” and leave it there</w:t>
       </w:r>
     </w:p>
     <w:p>
@@ -1093,7 +1093,7 @@
         <w:t xml:space="preserve">☐  </w:t>
       </w:r>
       <w:r>
-        <w:t>Другое: ____________________________________________________</w:t>
+        <w:t>Other: ______________________________________________________</w:t>
       </w:r>
     </w:p>
     <w:p>
@@ -1106,7 +1106,7 @@
           <w:i w:val="0"/>
           <w:sz w:val="28"/>
         </w:rPr>
-        <w:t>6.  2017 или 2018 · Запуск glidewell.io</w:t>
+        <w:t>6.  2017 or 2018 · The launch of glidewell.io</w:t>
       </w:r>
     </w:p>
     <w:p>
@@ -1121,7 +1121,7 @@
           <w:color w:val="787878"/>
           <w:sz w:val="17"/>
         </w:rPr>
-        <w:t>ЧТО СТОИТ В ЗАЛЕ</w:t>
+        <w:t>WHAT STANDS IN THE HALL</w:t>
       </w:r>
     </w:p>
     <w:p>
@@ -1130,7 +1130,7 @@
           <w:b w:val="0"/>
           <w:i w:val="0"/>
         </w:rPr>
-        <w:t>Карточка «GLIDEWELL.IO» стоит в 2017 году: «Announced November 2017: scanner, fastdesign.io and the fastmill.io mill on the dentist’s own counter…»</w:t>
+        <w:t>The GLIDEWELL.IO card stands in 2017: “Announced November 2017: scanner, fastdesign.io and the fastmill.io mill on the dentist’s own counter…”</w:t>
       </w:r>
     </w:p>
     <w:p>
@@ -1145,7 +1145,7 @@
           <w:color w:val="787878"/>
           <w:sz w:val="17"/>
         </w:rPr>
-        <w:t>ЧТО ГОВОРИТ КНИГА</w:t>
+        <w:t>WHAT THE BOOK SAYS</w:t>
       </w:r>
     </w:p>
     <w:p>
@@ -1157,7 +1157,7 @@
         <w:rPr>
           <w:i/>
         </w:rPr>
-        <w:t>«The glidewell.io™ In-Office Solution enjoyed a huge launch in 2018, enabling dentists to mill fully-sintered BruxZir zirconia crowns in a single appointment…»</w:t>
+        <w:t>“The glidewell.io™ In-Office Solution enjoyed a huge launch in 2018, enabling dentists to mill fully-sintered BruxZir zirconia crowns in a single appointment…”</w:t>
       </w:r>
     </w:p>
     <w:p>
@@ -1170,7 +1170,7 @@
           <w:color w:val="6E6E6E"/>
           <w:sz w:val="18"/>
         </w:rPr>
-        <w:t>Constant Change, глава о продуктах и R&amp;D</w:t>
+        <w:t>Constant Change, on products and R&amp;D</w:t>
       </w:r>
     </w:p>
     <w:p>
@@ -1185,7 +1185,7 @@
           <w:color w:val="787878"/>
           <w:sz w:val="17"/>
         </w:rPr>
-        <w:t>ЧТО СДЕЛАНО ПОКА</w:t>
+        <w:t>DONE SO FAR</w:t>
       </w:r>
     </w:p>
     <w:p>
@@ -1194,7 +1194,7 @@
           <w:b w:val="0"/>
           <w:i w:val="0"/>
         </w:rPr>
-        <w:t>Скорее всего, оба правы: анонс — ноябрь 2017, коммерческий запуск — 2018. Карточка осталась на 2017 году, статья говорит об анонсе.</w:t>
+        <w:t>Most likely both are right: announced November 2017, commercially launched in 2018. The card stays in 2017 and the article speaks of the announcement.</w:t>
       </w:r>
     </w:p>
     <w:p>
@@ -1209,7 +1209,7 @@
           <w:color w:val="787878"/>
           <w:sz w:val="17"/>
         </w:rPr>
-        <w:t>ВОПРОС</w:t>
+        <w:t>QUESTION</w:t>
       </w:r>
     </w:p>
     <w:p>
@@ -1221,7 +1221,7 @@
           <w:b/>
           <w:i w:val="0"/>
         </w:rPr>
-        <w:t>Где стоит карточка glidewell.io?</w:t>
+        <w:t>Where does the glidewell.io card stand?</w:t>
       </w:r>
     </w:p>
     <w:p>
@@ -1236,7 +1236,7 @@
         <w:t xml:space="preserve">☐  </w:t>
       </w:r>
       <w:r>
-        <w:t>2017 — год анонса (сейчас так)</w:t>
+        <w:t>2017 — the year of the announcement (as it stands now)</w:t>
       </w:r>
     </w:p>
     <w:p>
@@ -1251,7 +1251,7 @@
         <w:t xml:space="preserve">☐  </w:t>
       </w:r>
       <w:r>
-        <w:t>2018 — год запуска, по книге</w:t>
+        <w:t>2018 — the year of the launch, per the book</w:t>
       </w:r>
     </w:p>
     <w:p>
@@ -1266,7 +1266,7 @@
         <w:t xml:space="preserve">☐  </w:t>
       </w:r>
       <w:r>
-        <w:t>Оставить 2017, но в подзаголовок добавить «launched 2018»</w:t>
+        <w:t>Keep 2017, add “launched 2018” to the subtitle</w:t>
       </w:r>
     </w:p>
     <w:p>
@@ -1281,7 +1281,7 @@
         <w:t xml:space="preserve">☐  </w:t>
       </w:r>
       <w:r>
-        <w:t>Другое: ____________________________________________________</w:t>
+        <w:t>Other: ______________________________________________________</w:t>
       </w:r>
     </w:p>
     <w:p>
@@ -1298,7 +1298,7 @@
           <w:b w:val="0"/>
           <w:i w:val="0"/>
         </w:rPr>
-        <w:t>Подпись / дата: ________________________________________</w:t>
+        <w:t>Signature / date: ________________________________________</w:t>
       </w:r>
     </w:p>
     <w:sectPr>

</xml_diff>